<commit_message>
Mejora el formato y contenido de los documentos de Otro Si Alimentacion y Otro Si Rodamiento
</commit_message>
<xml_diff>
--- a/webapp/templates/word/Otro_Si_Alimentacion_15_Cyrgo.docx
+++ b/webapp/templates/word/Otro_Si_Alimentacion_15_Cyrgo.docx
@@ -147,6 +147,14 @@
         <w:rPr>
           <w:spacing w:val="-7"/>
         </w:rPr>
+        <w:t xml:space="preserve">No. </w:t>
+      </w:r>
+      <w:bookmarkStart w:id="0" w:name="_GoBack"/>
+      <w:bookmarkEnd w:id="0"/>
+      <w:r>
+        <w:rPr>
+          <w:spacing w:val="-7"/>
+        </w:rPr>
         <w:t xml:space="preserve">[[Cedula]] </w:t>
       </w:r>
       <w:r>
@@ -438,16 +446,8 @@
         <w:rPr>
           <w:rStyle w:val="Textoennegrita"/>
         </w:rPr>
-        <w:t>QUINCE MIL PESOS 00/100 MCTE. ($15.000,00</w:t>
-      </w:r>
-      <w:r>
-        <w:rPr>
-          <w:rStyle w:val="Textoennegrita"/>
-        </w:rPr>
-        <w:t xml:space="preserve">) </w:t>
-      </w:r>
-      <w:bookmarkStart w:id="0" w:name="_GoBack"/>
-      <w:bookmarkEnd w:id="0"/>
+        <w:t xml:space="preserve">QUINCE MIL PESOS 00/100 MCTE. ($15.000,00) </w:t>
+      </w:r>
       <w:r>
         <w:t>por día</w:t>
       </w:r>
@@ -2757,7 +2757,7 @@
             </wp:anchor>
           </w:drawing>
         </mc:Choice>
-        <mc:Fallback xmlns:w16du="http://schemas.microsoft.com/office/word/2023/wordml/word16du" xmlns:w16sdtfl="http://schemas.microsoft.com/office/word/2024/wordml/sdtformatlock" xmlns:w16sdtdh="http://schemas.microsoft.com/office/word/2020/wordml/sdtdatahash" xmlns:w16="http://schemas.microsoft.com/office/word/2018/wordml" xmlns:w16cex="http://schemas.microsoft.com/office/word/2018/wordml/cex" xmlns:oel="http://schemas.microsoft.com/office/2019/extlst">
+        <mc:Fallback xmlns:oel="http://schemas.microsoft.com/office/2019/extlst" xmlns:w16cex="http://schemas.microsoft.com/office/word/2018/wordml/cex" xmlns:w16="http://schemas.microsoft.com/office/word/2018/wordml" xmlns:w16sdtdh="http://schemas.microsoft.com/office/word/2020/wordml/sdtdatahash" xmlns:w16sdtfl="http://schemas.microsoft.com/office/word/2024/wordml/sdtformatlock" xmlns:w16du="http://schemas.microsoft.com/office/word/2023/wordml/word16du">
           <w:pict>
             <v:shape w14:anchorId="212C6BBF" id="Freeform 2" o:spid="_x0000_s1026" style="position:absolute;margin-left:348pt;margin-top:-20.5pt;width:152.5pt;height:50pt;z-index:251659264;visibility:visible;mso-wrap-style:square;mso-width-percent:0;mso-height-percent:0;mso-wrap-distance-left:9pt;mso-wrap-distance-top:0;mso-wrap-distance-right:9pt;mso-wrap-distance-bottom:0;mso-position-horizontal:absolute;mso-position-horizontal-relative:text;mso-position-vertical:absolute;mso-position-vertical-relative:text;mso-width-percent:0;mso-height-percent:0;mso-width-relative:margin;mso-height-relative:margin;v-text-anchor:top" coordsize="9718609,3119485" o:gfxdata="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" path="m,l9718608,r,3119485l,3119485,,xe" stroked="f">
               <v:fill r:id="rId2" o:title="" recolor="t" rotate="t" type="frame"/>

</xml_diff>